<commit_message>
update logo and cv
</commit_message>
<xml_diff>
--- a/public/cv/Pyae_Phyo_Maung_Resume.docx
+++ b/public/cv/Pyae_Phyo_Maung_Resume.docx
@@ -280,7 +280,23 @@
           <w:sz w:val="20"/>
           <w:szCs w:val="20"/>
         </w:rPr>
-        <w:t xml:space="preserve">Mysql, Javascript, Typescript, TailwindCss, Bootstrap, HTML, CSS, </w:t>
+        <w:t>Mysql, Javascript, Typescript,</w:t>
+      </w:r>
+      <w:r>
+        <w:rPr>
+          <w:rFonts w:ascii="Cambria" w:hAnsi="Cambria"/>
+          <w:sz w:val="20"/>
+          <w:szCs w:val="20"/>
+        </w:rPr>
+        <w:t xml:space="preserve"> PHP, Python,</w:t>
+      </w:r>
+      <w:r>
+        <w:rPr>
+          <w:rFonts w:ascii="Cambria" w:hAnsi="Cambria"/>
+          <w:sz w:val="20"/>
+          <w:szCs w:val="20"/>
+        </w:rPr>
+        <w:t xml:space="preserve"> TailwindCss, Bootstrap, HTML, CSS, </w:t>
       </w:r>
       <w:r>
         <w:rPr>
@@ -319,54 +335,23 @@
     <w:p>
       <w:pPr>
         <w:spacing w:line="16" w:lineRule="atLeast"/>
-        <w:jc w:val="both"/>
-        <w:rPr>
-          <w:rFonts w:ascii="Cambria" w:hAnsi="Cambria"/>
-          <w:b/>
-          <w:bCs/>
-          <w:sz w:val="20"/>
-          <w:szCs w:val="20"/>
-        </w:rPr>
-      </w:pPr>
-      <w:r>
-        <w:rPr>
-          <w:rFonts w:ascii="Cambria" w:hAnsi="Cambria"/>
-          <w:b/>
-          <w:bCs/>
-          <w:sz w:val="20"/>
-          <w:szCs w:val="20"/>
-        </w:rPr>
-        <w:t xml:space="preserve">Softguide Software House                                                                  </w:t>
-      </w:r>
-      <w:r>
-        <w:rPr>
-          <w:rFonts w:ascii="Cambria" w:hAnsi="Cambria"/>
-          <w:b/>
-          <w:bCs/>
-          <w:sz w:val="20"/>
-          <w:szCs w:val="20"/>
-        </w:rPr>
-        <w:t xml:space="preserve">     </w:t>
-      </w:r>
-      <w:r>
-        <w:rPr>
-          <w:rFonts w:ascii="Cambria" w:hAnsi="Cambria"/>
-          <w:b/>
-          <w:bCs/>
-          <w:sz w:val="20"/>
-          <w:szCs w:val="20"/>
-        </w:rPr>
-        <w:t xml:space="preserve">                                                                          </w:t>
-      </w:r>
-      <w:r>
-        <w:rPr>
-          <w:rFonts w:ascii="Cambria" w:hAnsi="Cambria"/>
-          <w:b/>
-          <w:bCs/>
-          <w:sz w:val="20"/>
-          <w:szCs w:val="20"/>
-        </w:rPr>
-        <w:t>August 2024 ~ Present</w:t>
+        <w:rPr>
+          <w:rFonts w:ascii="Cambria" w:hAnsi="Cambria"/>
+          <w:b/>
+          <w:bCs/>
+          <w:sz w:val="20"/>
+          <w:szCs w:val="20"/>
+        </w:rPr>
+      </w:pPr>
+      <w:r>
+        <w:rPr>
+          <w:rFonts w:ascii="Cambria" w:hAnsi="Cambria"/>
+          <w:b/>
+          <w:bCs/>
+          <w:sz w:val="20"/>
+          <w:szCs w:val="20"/>
+        </w:rPr>
+        <w:t>Softguide Software House</w:t>
       </w:r>
     </w:p>
     <w:p>
@@ -389,6 +374,36 @@
           <w:szCs w:val="20"/>
         </w:rPr>
         <w:t>Junior Full-stack Engineer</w:t>
+      </w:r>
+      <w:r>
+        <w:rPr>
+          <w:rFonts w:ascii="Cambria" w:hAnsi="Cambria"/>
+          <w:b/>
+          <w:bCs/>
+          <w:sz w:val="20"/>
+          <w:szCs w:val="20"/>
+        </w:rPr>
+        <w:t xml:space="preserve"> (</w:t>
+      </w:r>
+      <w:r>
+        <w:rPr>
+          <w:rFonts w:ascii="Cambria" w:hAnsi="Cambria"/>
+          <w:b/>
+          <w:bCs/>
+          <w:sz w:val="20"/>
+          <w:szCs w:val="20"/>
+        </w:rPr>
+        <w:t>August 2024 ~ Present</w:t>
+      </w:r>
+      <w:r>
+        <w:rPr>
+          <w:rFonts w:ascii="Cambria" w:hAnsi="Cambria"/>
+          <w:b/>
+          <w:bCs/>
+          <w:sz w:val="20"/>
+          <w:szCs w:val="20"/>
+        </w:rPr>
+        <w:t>)</w:t>
       </w:r>
     </w:p>
     <w:p>
@@ -753,7 +768,7 @@
           <w:sz w:val="22"/>
           <w:szCs w:val="22"/>
         </w:rPr>
-        <w:t>Projects</w:t>
+        <w:t>Education</w:t>
       </w:r>
     </w:p>
     <w:p>
@@ -775,43 +790,75 @@
           <w:sz w:val="20"/>
           <w:szCs w:val="20"/>
         </w:rPr>
-        <w:t>Poddy</w:t>
+        <w:t>University of the People</w:t>
+      </w:r>
+      <w:r>
+        <w:rPr>
+          <w:rFonts w:ascii="Cambria" w:hAnsi="Cambria"/>
+          <w:b/>
+          <w:bCs/>
+          <w:sz w:val="20"/>
+          <w:szCs w:val="20"/>
+        </w:rPr>
+        <w:t xml:space="preserve"> (</w:t>
+      </w:r>
+      <w:r>
+        <w:rPr>
+          <w:rFonts w:ascii="Cambria" w:hAnsi="Cambria"/>
+          <w:b/>
+          <w:bCs/>
+          <w:sz w:val="20"/>
+          <w:szCs w:val="20"/>
+        </w:rPr>
+        <w:t>November 2022 ~ Present</w:t>
+      </w:r>
+      <w:r>
+        <w:rPr>
+          <w:rFonts w:ascii="Cambria" w:hAnsi="Cambria"/>
+          <w:b/>
+          <w:bCs/>
+          <w:sz w:val="20"/>
+          <w:szCs w:val="20"/>
+        </w:rPr>
+        <w:t>)</w:t>
       </w:r>
     </w:p>
     <w:p>
       <w:pPr>
-        <w:pStyle w:val="ListParagraph"/>
-        <w:numPr>
-          <w:ilvl w:val="0"/>
-          <w:numId w:val="4"/>
-        </w:numPr>
         <w:spacing w:line="16" w:lineRule="atLeast"/>
         <w:rPr>
           <w:rFonts w:ascii="Cambria" w:hAnsi="Cambria"/>
-          <w:b/>
-          <w:bCs/>
-          <w:sz w:val="20"/>
-          <w:szCs w:val="20"/>
-        </w:rPr>
-      </w:pPr>
-      <w:r>
-        <w:rPr>
-          <w:rFonts w:ascii="Cambria" w:hAnsi="Cambria"/>
-          <w:b/>
-          <w:bCs/>
-          <w:sz w:val="20"/>
-          <w:szCs w:val="20"/>
-        </w:rPr>
-        <w:t>1</w:t>
+          <w:sz w:val="20"/>
+          <w:szCs w:val="20"/>
+        </w:rPr>
+      </w:pPr>
+      <w:r>
+        <w:rPr>
+          <w:rFonts w:ascii="Cambria" w:hAnsi="Cambria"/>
+          <w:sz w:val="20"/>
+          <w:szCs w:val="20"/>
+        </w:rPr>
+        <w:t xml:space="preserve">Associate Degree </w:t>
+      </w:r>
+      <w:r>
+        <w:rPr>
+          <w:rFonts w:ascii="Cambria" w:hAnsi="Cambria"/>
+          <w:sz w:val="20"/>
+          <w:szCs w:val="20"/>
+        </w:rPr>
+        <w:t>i</w:t>
+      </w:r>
+      <w:r>
+        <w:rPr>
+          <w:rFonts w:ascii="Cambria" w:hAnsi="Cambria"/>
+          <w:sz w:val="20"/>
+          <w:szCs w:val="20"/>
+        </w:rPr>
+        <w:t>n Computer Science</w:t>
       </w:r>
     </w:p>
     <w:p>
       <w:pPr>
-        <w:pStyle w:val="ListParagraph"/>
-        <w:numPr>
-          <w:ilvl w:val="0"/>
-          <w:numId w:val="4"/>
-        </w:numPr>
         <w:spacing w:line="16" w:lineRule="atLeast"/>
         <w:rPr>
           <w:rFonts w:ascii="Cambria" w:hAnsi="Cambria"/>
@@ -829,266 +876,27 @@
           <w:sz w:val="20"/>
           <w:szCs w:val="20"/>
         </w:rPr>
-        <w:t>2</w:t>
-      </w:r>
-    </w:p>
-    <w:p>
-      <w:pPr>
-        <w:spacing w:line="16" w:lineRule="atLeast"/>
-        <w:rPr>
-          <w:rFonts w:ascii="Cambria" w:hAnsi="Cambria"/>
-          <w:b/>
-          <w:bCs/>
-          <w:sz w:val="20"/>
-          <w:szCs w:val="20"/>
-        </w:rPr>
-      </w:pPr>
-      <w:r>
-        <w:rPr>
-          <w:rFonts w:ascii="Cambria" w:hAnsi="Cambria"/>
-          <w:b/>
-          <w:bCs/>
-          <w:sz w:val="20"/>
-          <w:szCs w:val="20"/>
-        </w:rPr>
-        <w:t>LaPayy</w:t>
-      </w:r>
-    </w:p>
-    <w:p>
-      <w:pPr>
-        <w:pStyle w:val="ListParagraph"/>
-        <w:numPr>
-          <w:ilvl w:val="0"/>
-          <w:numId w:val="5"/>
-        </w:numPr>
-        <w:spacing w:line="16" w:lineRule="atLeast"/>
-        <w:rPr>
-          <w:rFonts w:ascii="Cambria" w:hAnsi="Cambria"/>
-          <w:b/>
-          <w:bCs/>
-          <w:sz w:val="20"/>
-          <w:szCs w:val="20"/>
-        </w:rPr>
-      </w:pPr>
-      <w:r>
-        <w:rPr>
-          <w:rFonts w:ascii="Cambria" w:hAnsi="Cambria"/>
-          <w:b/>
-          <w:bCs/>
-          <w:sz w:val="20"/>
-          <w:szCs w:val="20"/>
-        </w:rPr>
-        <w:t>1</w:t>
-      </w:r>
-    </w:p>
-    <w:p>
-      <w:pPr>
-        <w:pStyle w:val="ListParagraph"/>
-        <w:numPr>
-          <w:ilvl w:val="0"/>
-          <w:numId w:val="5"/>
-        </w:numPr>
-        <w:spacing w:line="16" w:lineRule="atLeast"/>
-        <w:rPr>
-          <w:rFonts w:ascii="Cambria" w:hAnsi="Cambria"/>
-          <w:b/>
-          <w:bCs/>
-          <w:sz w:val="20"/>
-          <w:szCs w:val="20"/>
-        </w:rPr>
-      </w:pPr>
-      <w:r>
-        <w:rPr>
-          <w:rFonts w:ascii="Cambria" w:hAnsi="Cambria"/>
-          <w:b/>
-          <w:bCs/>
-          <w:sz w:val="20"/>
-          <w:szCs w:val="20"/>
-        </w:rPr>
-        <w:t>2</w:t>
-      </w:r>
-    </w:p>
-    <w:p>
-      <w:pPr>
-        <w:pBdr>
-          <w:bottom w:val="single" w:sz="12" w:space="1" w:color="auto"/>
-        </w:pBdr>
-        <w:spacing w:line="16" w:lineRule="atLeast"/>
-        <w:rPr>
-          <w:rFonts w:ascii="Cambria" w:hAnsi="Cambria"/>
-          <w:b/>
-          <w:bCs/>
-          <w:sz w:val="22"/>
-          <w:szCs w:val="22"/>
-        </w:rPr>
-      </w:pPr>
-      <w:r>
-        <w:rPr>
-          <w:rFonts w:ascii="Cambria" w:hAnsi="Cambria"/>
-          <w:b/>
-          <w:bCs/>
-          <w:sz w:val="22"/>
-          <w:szCs w:val="22"/>
-        </w:rPr>
-        <w:t>Education</w:t>
-      </w:r>
-    </w:p>
-    <w:p>
-      <w:pPr>
-        <w:spacing w:line="16" w:lineRule="atLeast"/>
-        <w:rPr>
-          <w:rFonts w:ascii="Cambria" w:hAnsi="Cambria"/>
-          <w:b/>
-          <w:bCs/>
-          <w:sz w:val="20"/>
-          <w:szCs w:val="20"/>
-        </w:rPr>
-      </w:pPr>
-      <w:r>
-        <w:rPr>
-          <w:rFonts w:ascii="Cambria" w:hAnsi="Cambria"/>
-          <w:b/>
-          <w:bCs/>
-          <w:sz w:val="20"/>
-          <w:szCs w:val="20"/>
-        </w:rPr>
-        <w:t>University of the People</w:t>
-      </w:r>
-      <w:r>
-        <w:rPr>
-          <w:rFonts w:ascii="Cambria" w:hAnsi="Cambria"/>
-          <w:b/>
-          <w:bCs/>
-          <w:sz w:val="20"/>
-          <w:szCs w:val="20"/>
-        </w:rPr>
-        <w:t xml:space="preserve">                                                                   </w:t>
-      </w:r>
-      <w:r>
-        <w:rPr>
-          <w:rFonts w:ascii="Cambria" w:hAnsi="Cambria"/>
-          <w:b/>
-          <w:bCs/>
-          <w:sz w:val="20"/>
-          <w:szCs w:val="20"/>
-        </w:rPr>
-        <w:t xml:space="preserve">                                                                          </w:t>
-      </w:r>
-      <w:r>
-        <w:rPr>
-          <w:rFonts w:ascii="Cambria" w:hAnsi="Cambria"/>
-          <w:b/>
-          <w:bCs/>
-          <w:sz w:val="20"/>
-          <w:szCs w:val="20"/>
-        </w:rPr>
-        <w:t>November 2022 ~ Present</w:t>
-      </w:r>
-    </w:p>
-    <w:p>
-      <w:pPr>
-        <w:spacing w:line="16" w:lineRule="atLeast"/>
-        <w:rPr>
-          <w:rFonts w:ascii="Cambria" w:hAnsi="Cambria"/>
-          <w:sz w:val="20"/>
-          <w:szCs w:val="20"/>
-        </w:rPr>
-      </w:pPr>
-      <w:r>
-        <w:rPr>
-          <w:rFonts w:ascii="Cambria" w:hAnsi="Cambria"/>
-          <w:sz w:val="20"/>
-          <w:szCs w:val="20"/>
-        </w:rPr>
-        <w:t xml:space="preserve">Associate Degree </w:t>
-      </w:r>
-      <w:r>
-        <w:rPr>
-          <w:rFonts w:ascii="Cambria" w:hAnsi="Cambria"/>
-          <w:sz w:val="20"/>
-          <w:szCs w:val="20"/>
-        </w:rPr>
-        <w:t>i</w:t>
-      </w:r>
-      <w:r>
-        <w:rPr>
-          <w:rFonts w:ascii="Cambria" w:hAnsi="Cambria"/>
-          <w:sz w:val="20"/>
-          <w:szCs w:val="20"/>
-        </w:rPr>
-        <w:t>n Computer Science</w:t>
-      </w:r>
-    </w:p>
-    <w:p>
-      <w:pPr>
-        <w:spacing w:line="16" w:lineRule="atLeast"/>
-        <w:rPr>
-          <w:rFonts w:ascii="Cambria" w:hAnsi="Cambria"/>
-          <w:b/>
-          <w:bCs/>
-          <w:sz w:val="20"/>
-          <w:szCs w:val="20"/>
-        </w:rPr>
-      </w:pPr>
-      <w:r>
-        <w:rPr>
-          <w:rFonts w:ascii="Cambria" w:hAnsi="Cambria"/>
-          <w:b/>
-          <w:bCs/>
-          <w:sz w:val="20"/>
-          <w:szCs w:val="20"/>
-        </w:rPr>
-        <w:t>Dagon University</w:t>
-      </w:r>
-      <w:r>
-        <w:rPr>
-          <w:rFonts w:ascii="Cambria" w:hAnsi="Cambria"/>
-          <w:b/>
-          <w:bCs/>
-          <w:sz w:val="20"/>
-          <w:szCs w:val="20"/>
-        </w:rPr>
-        <w:t xml:space="preserve">                                                                                </w:t>
-      </w:r>
-      <w:r>
-        <w:rPr>
-          <w:rFonts w:ascii="Cambria" w:hAnsi="Cambria"/>
-          <w:b/>
-          <w:bCs/>
-          <w:sz w:val="20"/>
-          <w:szCs w:val="20"/>
-        </w:rPr>
-        <w:t xml:space="preserve">    </w:t>
-      </w:r>
-      <w:r>
-        <w:rPr>
-          <w:rFonts w:ascii="Cambria" w:hAnsi="Cambria"/>
-          <w:b/>
-          <w:bCs/>
-          <w:sz w:val="20"/>
-          <w:szCs w:val="20"/>
-        </w:rPr>
-        <w:t xml:space="preserve">                                                                            </w:t>
-      </w:r>
-      <w:r>
-        <w:rPr>
-          <w:rFonts w:ascii="Cambria" w:hAnsi="Cambria"/>
-          <w:b/>
-          <w:bCs/>
-          <w:sz w:val="20"/>
-          <w:szCs w:val="20"/>
-        </w:rPr>
-        <w:t>October</w:t>
-      </w:r>
-      <w:r>
-        <w:rPr>
-          <w:rFonts w:ascii="Cambria" w:hAnsi="Cambria"/>
-          <w:b/>
-          <w:bCs/>
-          <w:sz w:val="20"/>
-          <w:szCs w:val="20"/>
-        </w:rPr>
-        <w:t xml:space="preserve"> 202</w:t>
+        <w:t>Dagon Universit</w:t>
+      </w:r>
+      <w:r>
+        <w:rPr>
+          <w:rFonts w:ascii="Cambria" w:hAnsi="Cambria"/>
+          <w:b/>
+          <w:bCs/>
+          <w:sz w:val="20"/>
+          <w:szCs w:val="20"/>
+        </w:rPr>
+        <w:t>y (</w:t>
+      </w:r>
+      <w:r>
+        <w:rPr>
+          <w:rFonts w:ascii="Cambria" w:hAnsi="Cambria"/>
+          <w:b/>
+          <w:bCs/>
+          <w:sz w:val="20"/>
+          <w:szCs w:val="20"/>
+        </w:rPr>
+        <w:t>October 202</w:t>
       </w:r>
       <w:r>
         <w:rPr>
@@ -1109,6 +917,16 @@
           <w:szCs w:val="20"/>
         </w:rPr>
         <w:t xml:space="preserve"> ~ Present</w:t>
+      </w:r>
+      <w:r>
+        <w:rPr>
+          <w:rFonts w:ascii="Cambria" w:hAnsi="Cambria"/>
+          <w:b/>
+          <w:bCs/>
+          <w:sz w:val="20"/>
+          <w:szCs w:val="20"/>
+        </w:rPr>
+        <w:t>)</w:t>
       </w:r>
     </w:p>
     <w:p>
@@ -2440,6 +2258,7 @@
   <w:style w:type="character" w:default="1" w:styleId="DefaultParagraphFont">
     <w:name w:val="Default Paragraph Font"/>
     <w:uiPriority w:val="1"/>
+    <w:semiHidden/>
     <w:unhideWhenUsed/>
   </w:style>
   <w:style w:type="table" w:default="1" w:styleId="TableNormal">

</xml_diff>